<commit_message>
Fix the clipped bottom of the rasterised architecture diagram
The screenshot viewport cut the diagram at the outcome boxes, losing their
last line and both footer notes. Render it in a viewport larger than the
drawing and crop to the SVG's own box instead.

Co-Authored-By: Claude Opus 5 <noreply@anthropic.com>
Claude-Session: https://claude.ai/code/session_01SjxotQWqvK4zB1bpi7ZfcT
</commit_message>
<xml_diff>
--- a/submission/Pavo_Cloud_Technical_Execution_Report.docx
+++ b/submission/Pavo_Cloud_Technical_Execution_Report.docx
@@ -1193,7 +1193,7 @@
       <w:r>
         <w:drawing>
           <wp:inline xmlns:a="http://schemas.openxmlformats.org/drawingml/2006/main" xmlns:pic="http://schemas.openxmlformats.org/drawingml/2006/picture">
-            <wp:extent cx="5943600" cy="3458095"/>
+            <wp:extent cx="5943600" cy="3453592"/>
             <wp:docPr id="1" name="Picture 1"/>
             <wp:cNvGraphicFramePr>
               <a:graphicFrameLocks noChangeAspect="1"/>
@@ -1214,7 +1214,7 @@
                   <pic:spPr>
                     <a:xfrm>
                       <a:off x="0" y="0"/>
-                      <a:ext cx="5943600" cy="3458095"/>
+                      <a:ext cx="5943600" cy="3453592"/>
                     </a:xfrm>
                     <a:prstGeom prst="rect"/>
                   </pic:spPr>

</xml_diff>

<commit_message>
Add the Google Docs build, and fix the figure-caption spacing
"cap" is a substring of "fcap", so the figure captions were picking up the
table-caption spacing in both the Word and Google Docs builds. Test the
more specific class first.

build_gdoc_html.py writes the HTML that Drive converts into the Google Doc.
It reads report.html, so the Doc cannot drift from the PDF; the figures are
referenced from this repository at a pinned commit because Drive's importer
drops data: URIs but does fetch http(s) ones.

Co-Authored-By: Claude Opus 5 <noreply@anthropic.com>
Claude-Session: https://claude.ai/code/session_01SjxotQWqvK4zB1bpi7ZfcT
</commit_message>
<xml_diff>
--- a/submission/Pavo_Cloud_Technical_Execution_Report.docx
+++ b/submission/Pavo_Cloud_Technical_Execution_Report.docx
@@ -1227,15 +1227,15 @@
     </w:p>
     <w:p>
       <w:pPr>
-        <w:keepNext/>
-        <w:spacing w:before="150" w:after="60" w:lineRule="exact" w:line="331"/>
+        <w:keepNext w:val="0"/>
+        <w:spacing w:before="45" w:after="150" w:lineRule="exact" w:line="260"/>
         <w:ind w:left="0" w:right="0"/>
       </w:pPr>
       <w:r>
         <w:rPr>
           <w:b w:val="0"/>
           <w:i/>
-          <w:sz w:val="24"/>
+          <w:sz w:val="21"/>
         </w:rPr>
         <w:t>Figure 1. One authorization request, end to end. The heavier box at step 5 is a gate: if the signature does not check out, the insurer's software never reads the request at all.</w:t>
       </w:r>
@@ -2289,15 +2289,15 @@
     </w:p>
     <w:p>
       <w:pPr>
-        <w:keepNext/>
-        <w:spacing w:before="150" w:after="60" w:lineRule="exact" w:line="331"/>
+        <w:keepNext w:val="0"/>
+        <w:spacing w:before="45" w:after="150" w:lineRule="exact" w:line="260"/>
         <w:ind w:left="0" w:right="0"/>
       </w:pPr>
       <w:r>
         <w:rPr>
           <w:b w:val="0"/>
           <w:i/>
-          <w:sz w:val="24"/>
+          <w:sz w:val="21"/>
         </w:rPr>
         <w:t>Figure 2. The commit history. Each line is a batch of work that was reviewed and merged. Phase 1 was the largest at 9,429 lines; the last entry fixes three problems that only appear once the software is deployed rather than run on a laptop.</w:t>
       </w:r>
@@ -2410,15 +2410,15 @@
     </w:p>
     <w:p>
       <w:pPr>
-        <w:keepNext/>
-        <w:spacing w:before="150" w:after="60" w:lineRule="exact" w:line="331"/>
+        <w:keepNext w:val="0"/>
+        <w:spacing w:before="45" w:after="150" w:lineRule="exact" w:line="260"/>
         <w:ind w:left="0" w:right="0"/>
       </w:pPr>
       <w:r>
         <w:rPr>
           <w:b w:val="0"/>
           <w:i/>
-          <w:sz w:val="24"/>
+          <w:sz w:val="21"/>
         </w:rPr>
         <w:t>Figure 3. The full test suite; each dot is one passing test. Among the things they prove: every decision records the rule that produced it, an unmatched request goes to a human rather than being guessed at, a tampered message is refused, a real patient identifier never reaches storage, and a rejected appeal is escalated rather than becoming an automatic final denial.</w:t>
       </w:r>

</xml_diff>

<commit_message>
Unify the figure captions at 9.5pt
Figures 1-3 were captioned at 10.5pt while the two screenshots in the figure
row were at 9.5pt. One size for all five is tidier and gives the print layout
back enough room that every page now runs 93-101% full.

The Google Doc keeps the diagram at full width. Shrinking it to fit the space
left on its page was tried at 380px and 350px; both close the gap but push a
blank ninth page, and eight pages matters more than the gap does.

Co-Authored-By: Claude Opus 5 <noreply@anthropic.com>
Claude-Session: https://claude.ai/code/session_01SjxotQWqvK4zB1bpi7ZfcT
</commit_message>
<xml_diff>
--- a/submission/Pavo_Cloud_Technical_Execution_Report.docx
+++ b/submission/Pavo_Cloud_Technical_Execution_Report.docx
@@ -7527,14 +7527,18 @@
       </w:r>
       <w:r>
         <w:rPr>
+          <w:rFonts w:ascii="Courier New" w:hAnsi="Courier New" w:cs="Courier New" w:eastAsia="Courier New"/>
+          <w:rFonts w:ascii="Courier New" w:hAnsi="Courier New"/>
           <w:b w:val="0"/>
           <w:i w:val="0"/>
-          <w:sz w:val="24"/>
+          <w:sz w:val="22"/>
         </w:rPr>
         <w:t>git log --shortstat 84c4ca5</w:t>
       </w:r>
       <w:r>
         <w:rPr>
+          <w:rFonts w:ascii="Courier New" w:hAnsi="Courier New" w:cs="Courier New" w:eastAsia="Courier New"/>
+          <w:rFonts w:ascii="Courier New" w:hAnsi="Courier New"/>
           <w:b w:val="0"/>
           <w:i w:val="0"/>
           <w:sz w:val="24"/>
@@ -7543,14 +7547,18 @@
       </w:r>
       <w:r>
         <w:rPr>
+          <w:rFonts w:ascii="Courier New" w:hAnsi="Courier New" w:cs="Courier New" w:eastAsia="Courier New"/>
+          <w:rFonts w:ascii="Courier New" w:hAnsi="Courier New"/>
           <w:b w:val="0"/>
           <w:i w:val="0"/>
-          <w:sz w:val="24"/>
+          <w:sz w:val="22"/>
         </w:rPr>
         <w:t>.venv/bin/python -m pytest</w:t>
       </w:r>
       <w:r>
         <w:rPr>
+          <w:rFonts w:ascii="Courier New" w:hAnsi="Courier New" w:cs="Courier New" w:eastAsia="Courier New"/>
+          <w:rFonts w:ascii="Courier New" w:hAnsi="Courier New"/>
           <w:b w:val="0"/>
           <w:i w:val="0"/>
           <w:sz w:val="24"/>
@@ -7559,14 +7567,18 @@
       </w:r>
       <w:r>
         <w:rPr>
+          <w:rFonts w:ascii="Courier New" w:hAnsi="Courier New" w:cs="Courier New" w:eastAsia="Courier New"/>
+          <w:rFonts w:ascii="Courier New" w:hAnsi="Courier New"/>
           <w:b w:val="0"/>
           <w:i w:val="0"/>
-          <w:sz w:val="24"/>
+          <w:sz w:val="22"/>
         </w:rPr>
         <w:t>/demo</w:t>
       </w:r>
       <w:r>
         <w:rPr>
+          <w:rFonts w:ascii="Courier New" w:hAnsi="Courier New" w:cs="Courier New" w:eastAsia="Courier New"/>
+          <w:rFonts w:ascii="Courier New" w:hAnsi="Courier New"/>
           <w:b w:val="0"/>
           <w:i w:val="0"/>
           <w:sz w:val="24"/>
@@ -7575,14 +7587,18 @@
       </w:r>
       <w:r>
         <w:rPr>
+          <w:rFonts w:ascii="Courier New" w:hAnsi="Courier New" w:cs="Courier New" w:eastAsia="Courier New"/>
+          <w:rFonts w:ascii="Courier New" w:hAnsi="Courier New"/>
           <w:b w:val="0"/>
           <w:i w:val="0"/>
-          <w:sz w:val="24"/>
+          <w:sz w:val="22"/>
         </w:rPr>
         <w:t>/audit</w:t>
       </w:r>
       <w:r>
         <w:rPr>
+          <w:rFonts w:ascii="Courier New" w:hAnsi="Courier New" w:cs="Courier New" w:eastAsia="Courier New"/>
+          <w:rFonts w:ascii="Courier New" w:hAnsi="Courier New"/>
           <w:b w:val="0"/>
           <w:i w:val="0"/>
           <w:sz w:val="24"/>

</xml_diff>